<commit_message>
Il Pomodoro: Menü-Fix und Vorlagen mit Platzhaltern
Co-Authored-By: Claude Opus 5.5 <noreply@anthropic.com>
Claude-Session: https://claude.ai/code/session_01RYK4C8JSxjodUTnQGYrFdL
</commit_message>
<xml_diff>
--- a/ilpomodoro-website/vorlagen-instagram/Il-Pomodoro-Neuigkeiten-Instagram.docx
+++ b/ilpomodoro-website/vorlagen-instagram/Il-Pomodoro-Neuigkeiten-Instagram.docx
@@ -63,39 +63,7 @@
           <w:sz w:val="104"/>
           <w:szCs w:val="104"/>
         </w:rPr>
-        <w:t xml:space="preserve">Wir machen</w:t>
-      </w:r>
-    </w:p>
-    <w:p>
-      <w:pPr>
-        <w:spacing w:after="0" w:before="0" w:line="1000" w:lineRule="exact"/>
-      </w:pPr>
-      <w:r>
-        <w:rPr>
-          <w:rFonts w:ascii="Bricolage Grotesque" w:cs="Bricolage Grotesque" w:eastAsia="Bricolage Grotesque" w:hAnsi="Bricolage Grotesque"/>
-          <w:b/>
-          <w:bCs/>
-          <w:color w:val="FAFBF8"/>
-          <w:sz w:val="104"/>
-          <w:szCs w:val="104"/>
-        </w:rPr>
-        <w:t xml:space="preserve">Weihnachts-</w:t>
-      </w:r>
-    </w:p>
-    <w:p>
-      <w:pPr>
-        <w:spacing w:after="0" w:before="0" w:line="1000" w:lineRule="exact"/>
-      </w:pPr>
-      <w:r>
-        <w:rPr>
-          <w:rFonts w:ascii="Bricolage Grotesque" w:cs="Bricolage Grotesque" w:eastAsia="Bricolage Grotesque" w:hAnsi="Bricolage Grotesque"/>
-          <w:b/>
-          <w:bCs/>
-          <w:color w:val="FAFBF8"/>
-          <w:sz w:val="104"/>
-          <w:szCs w:val="104"/>
-        </w:rPr>
-        <w:t xml:space="preserve">ferien</w:t>
+        <w:t xml:space="preserve">Überschrift</w:t>
       </w:r>
     </w:p>
     <w:p>
@@ -116,7 +84,7 @@
           <w:sz w:val="34"/>
           <w:szCs w:val="34"/>
         </w:rPr>
-        <w:t xml:space="preserve">Vom 24. Dezember bis 6. Januar bleibt unsere Küche kalt. Wir danken Ihnen für ein wunderbares Jahr und wünschen schöne Feiertage!</w:t>
+        <w:t xml:space="preserve">Hier steht Ihr Text. Zwei bis drei Sätze passen gut, zum Beispiel wann und warum.</w:t>
       </w:r>
     </w:p>
     <w:p>
@@ -141,7 +109,7 @@
           <w:sz w:val="32"/>
           <w:szCs w:val="32"/>
         </w:rPr>
-        <w:t xml:space="preserve">Ab 7. Januar wieder für Sie da</w:t>
+        <w:t xml:space="preserve">Datum oder Hinweis</w:t>
       </w:r>
     </w:p>
     <w:p>
@@ -215,23 +183,7 @@
           <w:sz w:val="104"/>
           <w:szCs w:val="104"/>
         </w:rPr>
-        <w:t xml:space="preserve">Weihnachtsfeier</w:t>
-      </w:r>
-    </w:p>
-    <w:p>
-      <w:pPr>
-        <w:spacing w:after="0" w:before="0" w:line="1000" w:lineRule="exact"/>
-      </w:pPr>
-      <w:r>
-        <w:rPr>
-          <w:rFonts w:ascii="Bricolage Grotesque" w:cs="Bricolage Grotesque" w:eastAsia="Bricolage Grotesque" w:hAnsi="Bricolage Grotesque"/>
-          <w:b/>
-          <w:bCs/>
-          <w:color w:val="151A17"/>
-          <w:sz w:val="104"/>
-          <w:szCs w:val="104"/>
-        </w:rPr>
-        <w:t xml:space="preserve">im Il Pomodoro</w:t>
+        <w:t xml:space="preserve">Überschrift</w:t>
       </w:r>
     </w:p>
     <w:p>
@@ -252,7 +204,7 @@
           <w:sz w:val="34"/>
           <w:szCs w:val="34"/>
         </w:rPr>
-        <w:t xml:space="preserve">Feiern Sie mit Ihrem Team oder Ihrer Familie bei uns: Antipasti, Pasta, Pizza aus dem Holzofen und Dolci, ganz nach Ihren Wünschen.</w:t>
+        <w:t xml:space="preserve">Hier steht Ihr Text. Zwei bis drei Sätze passen gut, zum Beispiel wann und warum.</w:t>
       </w:r>
     </w:p>
     <w:p>
@@ -277,7 +229,7 @@
           <w:sz w:val="32"/>
           <w:szCs w:val="32"/>
         </w:rPr>
-        <w:t xml:space="preserve">Jetzt anfragen: 0711 51 87 66 50</w:t>
+        <w:t xml:space="preserve">Datum oder Hinweis</w:t>
       </w:r>
     </w:p>
     <w:sectPr>

</xml_diff>